<commit_message>
Registrar novos prompts de IA utilizados e detalhar UC Processar Pagamento Externo
</commit_message>
<xml_diff>
--- a/docs/prompts-ia.docx
+++ b/docs/prompts-ia.docx
@@ -17,7 +17,7 @@
       <w:tr>
         <w:tc>
           <w:tcPr>
-            <w:tcW w:w="1458" w:type="dxa"/>
+            <w:tcW w:w="1524" w:type="dxa"/>
           </w:tcPr>
           <w:p>
             <w:pPr>
@@ -40,7 +40,7 @@
         </w:tc>
         <w:tc>
           <w:tcPr>
-            <w:tcW w:w="1656" w:type="dxa"/>
+            <w:tcW w:w="1650" w:type="dxa"/>
           </w:tcPr>
           <w:p>
             <w:pPr>
@@ -63,7 +63,7 @@
         </w:tc>
         <w:tc>
           <w:tcPr>
-            <w:tcW w:w="3544" w:type="dxa"/>
+            <w:tcW w:w="3514" w:type="dxa"/>
           </w:tcPr>
           <w:p>
             <w:pPr>
@@ -86,7 +86,7 @@
         </w:tc>
         <w:tc>
           <w:tcPr>
-            <w:tcW w:w="3798" w:type="dxa"/>
+            <w:tcW w:w="3768" w:type="dxa"/>
           </w:tcPr>
           <w:p>
             <w:pPr>
@@ -111,11 +111,11 @@
       <w:tr>
         <w:tc>
           <w:tcPr>
-            <w:tcW w:w="1458" w:type="dxa"/>
+            <w:tcW w:w="1524" w:type="dxa"/>
           </w:tcPr>
           <w:p>
             <w:pPr>
-              <w:jc w:val="both"/>
+              <w:jc w:val="center"/>
               <w:rPr>
                 <w:rFonts w:ascii="Arial" w:hAnsi="Arial" w:cs="Arial"/>
               </w:rPr>
@@ -130,7 +130,7 @@
         </w:tc>
         <w:tc>
           <w:tcPr>
-            <w:tcW w:w="1656" w:type="dxa"/>
+            <w:tcW w:w="1650" w:type="dxa"/>
           </w:tcPr>
           <w:p>
             <w:pPr>
@@ -143,14 +143,34 @@
               <w:rPr>
                 <w:rFonts w:ascii="Arial" w:hAnsi="Arial" w:cs="Arial"/>
               </w:rPr>
-              <w:t>Perguntar sobre a criação do Diagrama de Casos de Uso.</w:t>
+              <w:t>Entender como criar o Diagrama de Casos de Uso.</w:t>
             </w:r>
           </w:p>
         </w:tc>
         <w:tc>
           <w:tcPr>
-            <w:tcW w:w="3544" w:type="dxa"/>
+            <w:tcW w:w="3514" w:type="dxa"/>
           </w:tcPr>
+          <w:p>
+            <w:pPr>
+              <w:jc w:val="both"/>
+              <w:rPr>
+                <w:rFonts w:ascii="Arial" w:hAnsi="Arial" w:cs="Arial"/>
+                <w:color w:val="A6A6A6" w:themeColor="background1" w:themeShade="A6"/>
+                <w:sz w:val="20"/>
+                <w:szCs w:val="20"/>
+              </w:rPr>
+            </w:pPr>
+            <w:r>
+              <w:rPr>
+                <w:rFonts w:ascii="Arial" w:hAnsi="Arial" w:cs="Arial"/>
+                <w:color w:val="A6A6A6" w:themeColor="background1" w:themeShade="A6"/>
+                <w:sz w:val="20"/>
+                <w:szCs w:val="20"/>
+              </w:rPr>
+              <w:t>Nome do chat: Diagrama de Casos de Uso Multicanal</w:t>
+            </w:r>
+          </w:p>
           <w:p>
             <w:pPr>
               <w:jc w:val="both"/>
@@ -182,10 +202,10 @@
                   <v:path o:extrusionok="f" gradientshapeok="t" o:connecttype="rect"/>
                   <o:lock v:ext="edit" aspectratio="t"/>
                 </v:shapetype>
-                <v:shape id="_x0000_i1125" type="#_x0000_t75" style="width:77.25pt;height:49.5pt" o:ole="">
+                <v:shape id="_x0000_i1126" type="#_x0000_t75" style="width:77.25pt;height:49.5pt" o:ole="">
                   <v:imagedata r:id="rId5" o:title=""/>
                 </v:shape>
-                <o:OLEObject Type="Embed" ProgID="Package" ShapeID="_x0000_i1125" DrawAspect="Icon" ObjectID="_1841432810" r:id="rId6"/>
+                <o:OLEObject Type="Embed" ProgID="Package" ShapeID="_x0000_i1126" DrawAspect="Icon" ObjectID="_1841929542" r:id="rId6"/>
               </w:object>
             </w:r>
             <w:r>
@@ -193,10 +213,10 @@
                 <w:rFonts w:ascii="Arial" w:hAnsi="Arial" w:cs="Arial"/>
               </w:rPr>
               <w:object w:dxaOrig="1539" w:dyaOrig="997" w14:anchorId="4792A0E5">
-                <v:shape id="_x0000_i1126" type="#_x0000_t75" style="width:77.25pt;height:49.5pt" o:ole="">
+                <v:shape id="_x0000_i1127" type="#_x0000_t75" style="width:77.25pt;height:49.5pt" o:ole="">
                   <v:imagedata r:id="rId7" o:title=""/>
                 </v:shape>
-                <o:OLEObject Type="Embed" ProgID="Package" ShapeID="_x0000_i1126" DrawAspect="Icon" ObjectID="_1841432811" r:id="rId8"/>
+                <o:OLEObject Type="Embed" ProgID="Package" ShapeID="_x0000_i1127" DrawAspect="Icon" ObjectID="_1841929543" r:id="rId8"/>
               </w:object>
             </w:r>
           </w:p>
@@ -215,19 +235,11 @@
                 <w:rFonts w:ascii="Arial" w:hAnsi="Arial" w:cs="Arial"/>
               </w:rPr>
             </w:pPr>
-            <w:proofErr w:type="gramStart"/>
-            <w:r>
-              <w:rPr>
-                <w:rFonts w:ascii="Arial" w:hAnsi="Arial" w:cs="Arial"/>
-              </w:rPr>
-              <w:t>Analise</w:t>
-            </w:r>
-            <w:proofErr w:type="gramEnd"/>
-            <w:r>
-              <w:rPr>
-                <w:rFonts w:ascii="Arial" w:hAnsi="Arial" w:cs="Arial"/>
-              </w:rPr>
-              <w:t xml:space="preserve"> esses dois documentos. No documento "Roteiro de..." e na seção 4.1 Diagrama de Casos de Uso, menciona-se a necessidade da criação de </w:t>
+            <w:r>
+              <w:rPr>
+                <w:rFonts w:ascii="Arial" w:hAnsi="Arial" w:cs="Arial"/>
+              </w:rPr>
+              <w:t xml:space="preserve">Analise esses dois documentos. No documento "Roteiro de..." e na seção 4.1 Diagrama de Casos de Uso, menciona-se a necessidade da criação de </w:t>
             </w:r>
             <w:r>
               <w:rPr>
@@ -269,7 +281,7 @@
         </w:tc>
         <w:tc>
           <w:tcPr>
-            <w:tcW w:w="3798" w:type="dxa"/>
+            <w:tcW w:w="3768" w:type="dxa"/>
           </w:tcPr>
           <w:p>
             <w:pPr>
@@ -282,22 +294,1164 @@
               <w:rPr>
                 <w:rFonts w:ascii="Arial" w:hAnsi="Arial" w:cs="Arial"/>
               </w:rPr>
-              <w:t>Com base na análise minuciosa dos dois documentos da UNINTER fornecidos para o seu Projeto Multidisciplinar (Trilha Front-</w:t>
-            </w:r>
-            <w:proofErr w:type="spellStart"/>
-            <w:r>
-              <w:rPr>
-                <w:rFonts w:ascii="Arial" w:hAnsi="Arial" w:cs="Arial"/>
-              </w:rPr>
-              <w:t>End</w:t>
-            </w:r>
-            <w:proofErr w:type="spellEnd"/>
-            <w:r>
-              <w:rPr>
-                <w:rFonts w:ascii="Arial" w:hAnsi="Arial" w:cs="Arial"/>
-              </w:rPr>
-              <w:t>) de 2026, a resposta curta é: Sim, você deve estruturar a sua modelagem para cobrir toda a complexidade do sistema, mas o roteiro pede especificamente a elaboração de "Diagrama de Casos de Uso" (no singular e no plural ao longo do texto), contendo obrigatoriamente um grupo específico de atores.</w:t>
-            </w:r>
+              <w:t>Com base na análise minuciosa dos dois documentos da UNINTER fornecidos para o seu Projeto Multidisciplinar (Trilha Front-End) de 2026, a resposta curta é: Sim, você deve estruturar a sua modelagem para cobrir toda a complexidade do sistema, mas o roteiro pede especificamente a elaboração de "Diagrama de Casos de Uso" (no singular e no plural ao longo do texto), contendo obrigatoriamente um grupo específico de atores.</w:t>
+            </w:r>
+          </w:p>
+        </w:tc>
+      </w:tr>
+      <w:tr>
+        <w:tc>
+          <w:tcPr>
+            <w:tcW w:w="1524" w:type="dxa"/>
+          </w:tcPr>
+          <w:p>
+            <w:pPr>
+              <w:jc w:val="center"/>
+              <w:rPr>
+                <w:rFonts w:ascii="Arial" w:hAnsi="Arial" w:cs="Arial"/>
+              </w:rPr>
+            </w:pPr>
+            <w:r>
+              <w:rPr>
+                <w:rFonts w:ascii="Arial" w:hAnsi="Arial" w:cs="Arial"/>
+              </w:rPr>
+              <w:t>ChatGPT</w:t>
+            </w:r>
+          </w:p>
+        </w:tc>
+        <w:tc>
+          <w:tcPr>
+            <w:tcW w:w="1650" w:type="dxa"/>
+          </w:tcPr>
+          <w:p>
+            <w:pPr>
+              <w:jc w:val="both"/>
+              <w:rPr>
+                <w:rFonts w:ascii="Arial" w:hAnsi="Arial" w:cs="Arial"/>
+              </w:rPr>
+            </w:pPr>
+            <w:r>
+              <w:rPr>
+                <w:rFonts w:ascii="Arial" w:hAnsi="Arial" w:cs="Arial"/>
+              </w:rPr>
+              <w:t>Refinar Diagrama de Casos de Uso.</w:t>
+            </w:r>
+          </w:p>
+        </w:tc>
+        <w:tc>
+          <w:tcPr>
+            <w:tcW w:w="3514" w:type="dxa"/>
+          </w:tcPr>
+          <w:p>
+            <w:pPr>
+              <w:jc w:val="both"/>
+              <w:rPr>
+                <w:rFonts w:ascii="Arial" w:hAnsi="Arial" w:cs="Arial"/>
+                <w:color w:val="A6A6A6" w:themeColor="background1" w:themeShade="A6"/>
+                <w:sz w:val="20"/>
+                <w:szCs w:val="20"/>
+              </w:rPr>
+            </w:pPr>
+            <w:r>
+              <w:rPr>
+                <w:rFonts w:ascii="Arial" w:hAnsi="Arial" w:cs="Arial"/>
+                <w:color w:val="A6A6A6" w:themeColor="background1" w:themeShade="A6"/>
+                <w:sz w:val="20"/>
+                <w:szCs w:val="20"/>
+              </w:rPr>
+              <w:t xml:space="preserve">Nome do chat: </w:t>
+            </w:r>
+            <w:r>
+              <w:rPr>
+                <w:rFonts w:ascii="Arial" w:hAnsi="Arial" w:cs="Arial"/>
+                <w:color w:val="A6A6A6" w:themeColor="background1" w:themeShade="A6"/>
+                <w:sz w:val="20"/>
+                <w:szCs w:val="20"/>
+              </w:rPr>
+              <w:t>Ajuda com Projeto</w:t>
+            </w:r>
+          </w:p>
+          <w:p>
+            <w:pPr>
+              <w:jc w:val="both"/>
+              <w:rPr>
+                <w:rFonts w:ascii="Arial" w:hAnsi="Arial" w:cs="Arial"/>
+              </w:rPr>
+            </w:pPr>
+          </w:p>
+          <w:p>
+            <w:pPr>
+              <w:jc w:val="both"/>
+              <w:rPr>
+                <w:rFonts w:ascii="Arial" w:hAnsi="Arial" w:cs="Arial"/>
+              </w:rPr>
+            </w:pPr>
+            <w:r>
+              <w:rPr>
+                <w:rFonts w:ascii="Arial" w:hAnsi="Arial" w:cs="Arial"/>
+                <w:noProof/>
+              </w:rPr>
+              <w:drawing>
+                <wp:inline distT="0" distB="0" distL="0" distR="0" wp14:anchorId="5DDFAD39" wp14:editId="30C9FAA0">
+                  <wp:extent cx="740370" cy="866775"/>
+                  <wp:effectExtent l="0" t="0" r="3175" b="0"/>
+                  <wp:docPr id="266258332" name="Imagem 3"/>
+                  <wp:cNvGraphicFramePr>
+                    <a:graphicFrameLocks xmlns:a="http://schemas.openxmlformats.org/drawingml/2006/main" noChangeAspect="1"/>
+                  </wp:cNvGraphicFramePr>
+                  <a:graphic xmlns:a="http://schemas.openxmlformats.org/drawingml/2006/main">
+                    <a:graphicData uri="http://schemas.openxmlformats.org/drawingml/2006/picture">
+                      <pic:pic xmlns:pic="http://schemas.openxmlformats.org/drawingml/2006/picture">
+                        <pic:nvPicPr>
+                          <pic:cNvPr id="0" name="Picture 107"/>
+                          <pic:cNvPicPr>
+                            <a:picLocks noChangeAspect="1" noChangeArrowheads="1"/>
+                          </pic:cNvPicPr>
+                        </pic:nvPicPr>
+                        <pic:blipFill>
+                          <a:blip r:embed="rId9" cstate="print">
+                            <a:extLst>
+                              <a:ext uri="{28A0092B-C50C-407E-A947-70E740481C1C}">
+                                <a14:useLocalDpi xmlns:a14="http://schemas.microsoft.com/office/drawing/2010/main" val="0"/>
+                              </a:ext>
+                            </a:extLst>
+                          </a:blip>
+                          <a:srcRect/>
+                          <a:stretch>
+                            <a:fillRect/>
+                          </a:stretch>
+                        </pic:blipFill>
+                        <pic:spPr bwMode="auto">
+                          <a:xfrm>
+                            <a:off x="0" y="0"/>
+                            <a:ext cx="747121" cy="874679"/>
+                          </a:xfrm>
+                          <a:prstGeom prst="rect">
+                            <a:avLst/>
+                          </a:prstGeom>
+                          <a:noFill/>
+                          <a:ln>
+                            <a:noFill/>
+                          </a:ln>
+                        </pic:spPr>
+                      </pic:pic>
+                    </a:graphicData>
+                  </a:graphic>
+                </wp:inline>
+              </w:drawing>
+            </w:r>
+            <w:r>
+              <w:rPr>
+                <w:rFonts w:ascii="Arial" w:hAnsi="Arial" w:cs="Arial"/>
+              </w:rPr>
+              <w:object w:dxaOrig="1539" w:dyaOrig="997" w14:anchorId="5DA42E4A">
+                <v:shape id="_x0000_i1132" type="#_x0000_t75" style="width:77.25pt;height:49.5pt" o:ole="">
+                  <v:imagedata r:id="rId10" o:title=""/>
+                </v:shape>
+                <o:OLEObject Type="Embed" ProgID="Package" ShapeID="_x0000_i1132" DrawAspect="Icon" ObjectID="_1841929544" r:id="rId11"/>
+              </w:object>
+            </w:r>
+          </w:p>
+          <w:p>
+            <w:pPr>
+              <w:jc w:val="both"/>
+              <w:rPr>
+                <w:rFonts w:ascii="Arial" w:hAnsi="Arial" w:cs="Arial"/>
+              </w:rPr>
+            </w:pPr>
+          </w:p>
+          <w:p>
+            <w:pPr>
+              <w:jc w:val="both"/>
+              <w:rPr>
+                <w:rFonts w:ascii="Arial" w:hAnsi="Arial" w:cs="Arial"/>
+              </w:rPr>
+            </w:pPr>
+            <w:r>
+              <w:rPr>
+                <w:rFonts w:ascii="Arial" w:hAnsi="Arial" w:cs="Arial"/>
+              </w:rPr>
+              <w:t xml:space="preserve">Estou realizando um projeto da faculdade sobre uma rede de franquias fictícia chamada Raízes do Norte. Veja o </w:t>
+            </w:r>
+            <w:r>
+              <w:rPr>
+                <w:rFonts w:ascii="Arial" w:hAnsi="Arial" w:cs="Arial"/>
+              </w:rPr>
+              <w:t>Diagrama de Casos de Uso e a lista de requisitos coletados</w:t>
+            </w:r>
+            <w:r>
+              <w:rPr>
+                <w:rFonts w:ascii="Arial" w:hAnsi="Arial" w:cs="Arial"/>
+              </w:rPr>
+              <w:t>. Com isso, me diga:</w:t>
+            </w:r>
+            <w:r>
+              <w:rPr>
+                <w:rFonts w:ascii="Arial" w:hAnsi="Arial" w:cs="Arial"/>
+              </w:rPr>
+              <w:t xml:space="preserve"> </w:t>
+            </w:r>
+            <w:r>
+              <w:rPr>
+                <w:rFonts w:ascii="Arial" w:hAnsi="Arial" w:cs="Arial"/>
+              </w:rPr>
+              <w:t>devo criar um caso de uso Gerenciar Produtos para agrupar as ações do Gerente/Administrador?</w:t>
+            </w:r>
+          </w:p>
+        </w:tc>
+        <w:tc>
+          <w:tcPr>
+            <w:tcW w:w="3768" w:type="dxa"/>
+          </w:tcPr>
+          <w:p>
+            <w:pPr>
+              <w:jc w:val="both"/>
+              <w:rPr>
+                <w:rFonts w:ascii="Arial" w:hAnsi="Arial" w:cs="Arial"/>
+              </w:rPr>
+            </w:pPr>
+            <w:r>
+              <w:rPr>
+                <w:rFonts w:ascii="Arial" w:hAnsi="Arial" w:cs="Arial"/>
+              </w:rPr>
+              <w:t xml:space="preserve">Minha resposta curta: </w:t>
+            </w:r>
+            <w:r>
+              <w:rPr>
+                <w:rFonts w:ascii="Arial" w:hAnsi="Arial" w:cs="Arial"/>
+                <w:b/>
+                <w:bCs/>
+              </w:rPr>
+              <w:t>não, eu não criaria</w:t>
+            </w:r>
+            <w:r>
+              <w:rPr>
+                <w:rFonts w:ascii="Arial" w:hAnsi="Arial" w:cs="Arial"/>
+              </w:rPr>
+              <w:t>.</w:t>
+            </w:r>
+          </w:p>
+          <w:p>
+            <w:pPr>
+              <w:jc w:val="both"/>
+              <w:rPr>
+                <w:rFonts w:ascii="Arial" w:hAnsi="Arial" w:cs="Arial"/>
+              </w:rPr>
+            </w:pPr>
+            <w:r>
+              <w:rPr>
+                <w:rFonts w:ascii="Arial" w:hAnsi="Arial" w:cs="Arial"/>
+              </w:rPr>
+              <w:t xml:space="preserve">Depois de olhar o diagrama inteiro e os RFs, acho que o </w:t>
+            </w:r>
+            <w:r>
+              <w:rPr>
+                <w:rFonts w:ascii="Arial" w:hAnsi="Arial" w:cs="Arial"/>
+                <w:b/>
+                <w:bCs/>
+              </w:rPr>
+              <w:t>Gerenciar Produtos</w:t>
+            </w:r>
+            <w:r>
+              <w:rPr>
+                <w:rFonts w:ascii="Arial" w:hAnsi="Arial" w:cs="Arial"/>
+              </w:rPr>
+              <w:t xml:space="preserve"> acaba sendo mais redundante do que útil.</w:t>
+            </w:r>
+          </w:p>
+          <w:p>
+            <w:pPr>
+              <w:jc w:val="both"/>
+              <w:rPr>
+                <w:rFonts w:ascii="Arial" w:hAnsi="Arial" w:cs="Arial"/>
+              </w:rPr>
+            </w:pPr>
+          </w:p>
+          <w:p>
+            <w:pPr>
+              <w:jc w:val="both"/>
+              <w:rPr>
+                <w:rFonts w:ascii="Arial" w:hAnsi="Arial" w:cs="Arial"/>
+              </w:rPr>
+            </w:pPr>
+            <w:r>
+              <w:rPr>
+                <w:rFonts w:ascii="Arial" w:hAnsi="Arial" w:cs="Arial"/>
+              </w:rPr>
+              <w:t>Explico.</w:t>
+            </w:r>
+          </w:p>
+          <w:p>
+            <w:pPr>
+              <w:jc w:val="both"/>
+              <w:rPr>
+                <w:rFonts w:ascii="Arial" w:hAnsi="Arial" w:cs="Arial"/>
+              </w:rPr>
+            </w:pPr>
+          </w:p>
+          <w:p>
+            <w:pPr>
+              <w:jc w:val="both"/>
+              <w:rPr>
+                <w:rFonts w:ascii="Arial" w:hAnsi="Arial" w:cs="Arial"/>
+              </w:rPr>
+            </w:pPr>
+            <w:r>
+              <w:rPr>
+                <w:rFonts w:ascii="Arial" w:hAnsi="Arial" w:cs="Arial"/>
+              </w:rPr>
+              <w:t>Você já tem:</w:t>
+            </w:r>
+          </w:p>
+          <w:p>
+            <w:pPr>
+              <w:numPr>
+                <w:ilvl w:val="0"/>
+                <w:numId w:val="7"/>
+              </w:numPr>
+              <w:jc w:val="both"/>
+              <w:rPr>
+                <w:rFonts w:ascii="Arial" w:hAnsi="Arial" w:cs="Arial"/>
+              </w:rPr>
+            </w:pPr>
+            <w:r>
+              <w:rPr>
+                <w:rFonts w:ascii="Arial" w:hAnsi="Arial" w:cs="Arial"/>
+                <w:b/>
+                <w:bCs/>
+              </w:rPr>
+              <w:t>Controlar Disponibilidade de Produtos</w:t>
+            </w:r>
+            <w:r>
+              <w:rPr>
+                <w:rFonts w:ascii="Arial" w:hAnsi="Arial" w:cs="Arial"/>
+              </w:rPr>
+              <w:t xml:space="preserve"> (RF06) </w:t>
+            </w:r>
+          </w:p>
+          <w:p>
+            <w:pPr>
+              <w:numPr>
+                <w:ilvl w:val="0"/>
+                <w:numId w:val="7"/>
+              </w:numPr>
+              <w:jc w:val="both"/>
+              <w:rPr>
+                <w:rFonts w:ascii="Arial" w:hAnsi="Arial" w:cs="Arial"/>
+              </w:rPr>
+            </w:pPr>
+            <w:r>
+              <w:rPr>
+                <w:rFonts w:ascii="Arial" w:hAnsi="Arial" w:cs="Arial"/>
+                <w:b/>
+                <w:bCs/>
+              </w:rPr>
+              <w:t>Definir Disponibilidade de Produtos Sazonais</w:t>
+            </w:r>
+            <w:r>
+              <w:rPr>
+                <w:rFonts w:ascii="Arial" w:hAnsi="Arial" w:cs="Arial"/>
+              </w:rPr>
+              <w:t xml:space="preserve"> (RF07) </w:t>
+            </w:r>
+          </w:p>
+          <w:p>
+            <w:pPr>
+              <w:numPr>
+                <w:ilvl w:val="0"/>
+                <w:numId w:val="7"/>
+              </w:numPr>
+              <w:jc w:val="both"/>
+              <w:rPr>
+                <w:rFonts w:ascii="Arial" w:hAnsi="Arial" w:cs="Arial"/>
+              </w:rPr>
+            </w:pPr>
+            <w:r>
+              <w:rPr>
+                <w:rFonts w:ascii="Arial" w:hAnsi="Arial" w:cs="Arial"/>
+                <w:b/>
+                <w:bCs/>
+              </w:rPr>
+              <w:t>Configurar Receitas Regionais</w:t>
+            </w:r>
+            <w:r>
+              <w:rPr>
+                <w:rFonts w:ascii="Arial" w:hAnsi="Arial" w:cs="Arial"/>
+              </w:rPr>
+              <w:t xml:space="preserve"> (RF08) </w:t>
+            </w:r>
+          </w:p>
+          <w:p>
+            <w:pPr>
+              <w:jc w:val="both"/>
+              <w:rPr>
+                <w:rFonts w:ascii="Arial" w:hAnsi="Arial" w:cs="Arial"/>
+              </w:rPr>
+            </w:pPr>
+          </w:p>
+          <w:p>
+            <w:pPr>
+              <w:jc w:val="both"/>
+              <w:rPr>
+                <w:rFonts w:ascii="Arial" w:hAnsi="Arial" w:cs="Arial"/>
+              </w:rPr>
+            </w:pPr>
+            <w:r>
+              <w:rPr>
+                <w:rFonts w:ascii="Arial" w:hAnsi="Arial" w:cs="Arial"/>
+              </w:rPr>
+              <w:t>Esses três já representam claramente o domínio de gestão de produtos.</w:t>
+            </w:r>
+          </w:p>
+          <w:p>
+            <w:pPr>
+              <w:jc w:val="both"/>
+              <w:rPr>
+                <w:rFonts w:ascii="Arial" w:hAnsi="Arial" w:cs="Arial"/>
+              </w:rPr>
+            </w:pPr>
+          </w:p>
+          <w:p>
+            <w:pPr>
+              <w:jc w:val="both"/>
+              <w:rPr>
+                <w:rFonts w:ascii="Arial" w:hAnsi="Arial" w:cs="Arial"/>
+              </w:rPr>
+            </w:pPr>
+            <w:r>
+              <w:rPr>
+                <w:rFonts w:ascii="Arial" w:hAnsi="Arial" w:cs="Arial"/>
+              </w:rPr>
+              <w:t>Se você criar:</w:t>
+            </w:r>
+          </w:p>
+          <w:p>
+            <w:pPr>
+              <w:jc w:val="both"/>
+              <w:rPr>
+                <w:rFonts w:ascii="Arial" w:hAnsi="Arial" w:cs="Arial"/>
+              </w:rPr>
+            </w:pPr>
+          </w:p>
+          <w:p>
+            <w:pPr>
+              <w:jc w:val="both"/>
+              <w:rPr>
+                <w:rFonts w:ascii="Arial" w:hAnsi="Arial" w:cs="Arial"/>
+              </w:rPr>
+            </w:pPr>
+            <w:r>
+              <w:rPr>
+                <w:rFonts w:ascii="Arial" w:hAnsi="Arial" w:cs="Arial"/>
+              </w:rPr>
+              <w:t>Gerenciar Produtos</w:t>
+            </w:r>
+          </w:p>
+          <w:p>
+            <w:pPr>
+              <w:jc w:val="both"/>
+              <w:rPr>
+                <w:rFonts w:ascii="Arial" w:hAnsi="Arial" w:cs="Arial"/>
+              </w:rPr>
+            </w:pPr>
+            <w:r>
+              <w:rPr>
+                <w:rFonts w:ascii="Arial" w:hAnsi="Arial" w:cs="Arial"/>
+              </w:rPr>
+              <w:t>com include, a leitura vira:</w:t>
+            </w:r>
+          </w:p>
+          <w:p>
+            <w:pPr>
+              <w:jc w:val="both"/>
+              <w:rPr>
+                <w:rFonts w:ascii="Arial" w:hAnsi="Arial" w:cs="Arial"/>
+              </w:rPr>
+            </w:pPr>
+            <w:r>
+              <w:rPr>
+                <w:rFonts w:ascii="Arial" w:hAnsi="Arial" w:cs="Arial"/>
+              </w:rPr>
+              <w:t>Gerenciar Produtos inclui...</w:t>
+            </w:r>
+          </w:p>
+          <w:p>
+            <w:pPr>
+              <w:jc w:val="both"/>
+              <w:rPr>
+                <w:rFonts w:ascii="Arial" w:hAnsi="Arial" w:cs="Arial"/>
+              </w:rPr>
+            </w:pPr>
+          </w:p>
+          <w:p>
+            <w:pPr>
+              <w:jc w:val="both"/>
+              <w:rPr>
+                <w:rFonts w:ascii="Arial" w:hAnsi="Arial" w:cs="Arial"/>
+              </w:rPr>
+            </w:pPr>
+            <w:r>
+              <w:rPr>
+                <w:rFonts w:ascii="Arial" w:hAnsi="Arial" w:cs="Arial"/>
+              </w:rPr>
+              <w:t>O que importa é</w:t>
+            </w:r>
+            <w:r>
+              <w:rPr>
+                <w:rFonts w:ascii="Arial" w:hAnsi="Arial" w:cs="Arial"/>
+              </w:rPr>
+              <w:t>:</w:t>
+            </w:r>
+          </w:p>
+          <w:p>
+            <w:pPr>
+              <w:jc w:val="both"/>
+              <w:rPr>
+                <w:rFonts w:ascii="Arial" w:hAnsi="Arial" w:cs="Arial"/>
+              </w:rPr>
+            </w:pPr>
+          </w:p>
+          <w:p>
+            <w:pPr>
+              <w:jc w:val="both"/>
+              <w:rPr>
+                <w:rFonts w:ascii="Arial" w:hAnsi="Arial" w:cs="Arial"/>
+              </w:rPr>
+            </w:pPr>
+            <w:r>
+              <w:rPr>
+                <w:rFonts w:ascii="Arial" w:hAnsi="Arial" w:cs="Arial"/>
+              </w:rPr>
+              <w:t>os RFs estão explícitos e rastreáveis?</w:t>
+            </w:r>
+          </w:p>
+          <w:p>
+            <w:pPr>
+              <w:jc w:val="both"/>
+              <w:rPr>
+                <w:rFonts w:ascii="Arial" w:hAnsi="Arial" w:cs="Arial"/>
+              </w:rPr>
+            </w:pPr>
+          </w:p>
+          <w:p>
+            <w:pPr>
+              <w:jc w:val="both"/>
+              <w:rPr>
+                <w:rFonts w:ascii="Arial" w:hAnsi="Arial" w:cs="Arial"/>
+              </w:rPr>
+            </w:pPr>
+            <w:r>
+              <w:rPr>
+                <w:rFonts w:ascii="Arial" w:hAnsi="Arial" w:cs="Arial"/>
+              </w:rPr>
+              <w:t>E hoje eles já estão.</w:t>
+            </w:r>
+          </w:p>
+          <w:p>
+            <w:pPr>
+              <w:jc w:val="both"/>
+              <w:rPr>
+                <w:rFonts w:ascii="Arial" w:hAnsi="Arial" w:cs="Arial"/>
+              </w:rPr>
+            </w:pPr>
+          </w:p>
+        </w:tc>
+      </w:tr>
+      <w:tr>
+        <w:tc>
+          <w:tcPr>
+            <w:tcW w:w="1524" w:type="dxa"/>
+          </w:tcPr>
+          <w:p>
+            <w:pPr>
+              <w:jc w:val="center"/>
+              <w:rPr>
+                <w:rFonts w:ascii="Arial" w:hAnsi="Arial" w:cs="Arial"/>
+              </w:rPr>
+            </w:pPr>
+            <w:r>
+              <w:rPr>
+                <w:rFonts w:ascii="Arial" w:hAnsi="Arial" w:cs="Arial"/>
+              </w:rPr>
+              <w:lastRenderedPageBreak/>
+              <w:t>ChatGPT</w:t>
+            </w:r>
+          </w:p>
+        </w:tc>
+        <w:tc>
+          <w:tcPr>
+            <w:tcW w:w="1650" w:type="dxa"/>
+          </w:tcPr>
+          <w:p>
+            <w:pPr>
+              <w:jc w:val="both"/>
+              <w:rPr>
+                <w:rFonts w:ascii="Arial" w:hAnsi="Arial" w:cs="Arial"/>
+              </w:rPr>
+            </w:pPr>
+            <w:r>
+              <w:rPr>
+                <w:rFonts w:ascii="Arial" w:hAnsi="Arial" w:cs="Arial"/>
+              </w:rPr>
+              <w:t>Refinar Diagrama de Casos de Uso.</w:t>
+            </w:r>
+          </w:p>
+        </w:tc>
+        <w:tc>
+          <w:tcPr>
+            <w:tcW w:w="3514" w:type="dxa"/>
+          </w:tcPr>
+          <w:p>
+            <w:pPr>
+              <w:jc w:val="both"/>
+              <w:rPr>
+                <w:rFonts w:ascii="Arial" w:hAnsi="Arial" w:cs="Arial"/>
+                <w:color w:val="A6A6A6" w:themeColor="background1" w:themeShade="A6"/>
+                <w:sz w:val="20"/>
+                <w:szCs w:val="20"/>
+              </w:rPr>
+            </w:pPr>
+            <w:r>
+              <w:rPr>
+                <w:rFonts w:ascii="Arial" w:hAnsi="Arial" w:cs="Arial"/>
+                <w:color w:val="A6A6A6" w:themeColor="background1" w:themeShade="A6"/>
+                <w:sz w:val="20"/>
+                <w:szCs w:val="20"/>
+              </w:rPr>
+              <w:t xml:space="preserve">Nome do chat: </w:t>
+            </w:r>
+            <w:r>
+              <w:rPr>
+                <w:rFonts w:ascii="Arial" w:hAnsi="Arial" w:cs="Arial"/>
+                <w:color w:val="A6A6A6" w:themeColor="background1" w:themeShade="A6"/>
+                <w:sz w:val="20"/>
+                <w:szCs w:val="20"/>
+              </w:rPr>
+              <w:t>Ajuda com Projeto</w:t>
+            </w:r>
+          </w:p>
+          <w:p>
+            <w:pPr>
+              <w:jc w:val="both"/>
+              <w:rPr>
+                <w:rFonts w:ascii="Arial" w:hAnsi="Arial" w:cs="Arial"/>
+                <w:noProof/>
+              </w:rPr>
+            </w:pPr>
+          </w:p>
+          <w:p>
+            <w:pPr>
+              <w:jc w:val="both"/>
+              <w:rPr>
+                <w:rFonts w:ascii="Arial" w:hAnsi="Arial" w:cs="Arial"/>
+                <w:noProof/>
+              </w:rPr>
+            </w:pPr>
+            <w:r>
+              <w:rPr>
+                <w:rFonts w:ascii="Arial" w:hAnsi="Arial" w:cs="Arial"/>
+                <w:noProof/>
+              </w:rPr>
+              <w:t>M</w:t>
+            </w:r>
+            <w:r>
+              <w:rPr>
+                <w:rFonts w:ascii="Arial" w:hAnsi="Arial" w:cs="Arial"/>
+                <w:noProof/>
+              </w:rPr>
+              <w:t>ais uma pergunta: acredita que colocar Selecionar Produtos como include de Realizar Pedido é uma boa?</w:t>
+            </w:r>
+          </w:p>
+        </w:tc>
+        <w:tc>
+          <w:tcPr>
+            <w:tcW w:w="3768" w:type="dxa"/>
+          </w:tcPr>
+          <w:p>
+            <w:pPr>
+              <w:jc w:val="both"/>
+              <w:rPr>
+                <w:rFonts w:ascii="Arial" w:hAnsi="Arial" w:cs="Arial"/>
+              </w:rPr>
+            </w:pPr>
+            <w:r>
+              <w:rPr>
+                <w:rFonts w:ascii="Arial" w:hAnsi="Arial" w:cs="Arial"/>
+              </w:rPr>
+              <w:t xml:space="preserve">Com include, você enfatiza o </w:t>
+            </w:r>
+            <w:r>
+              <w:rPr>
+                <w:rFonts w:ascii="Arial" w:hAnsi="Arial" w:cs="Arial"/>
+                <w:b/>
+                <w:bCs/>
+              </w:rPr>
+              <w:t>fluxo obrigatório</w:t>
+            </w:r>
+            <w:r>
+              <w:rPr>
+                <w:rFonts w:ascii="Arial" w:hAnsi="Arial" w:cs="Arial"/>
+              </w:rPr>
+              <w:t>:</w:t>
+            </w:r>
+          </w:p>
+          <w:p>
+            <w:pPr>
+              <w:jc w:val="both"/>
+              <w:rPr>
+                <w:rFonts w:ascii="Arial" w:hAnsi="Arial" w:cs="Arial"/>
+              </w:rPr>
+            </w:pPr>
+          </w:p>
+          <w:p>
+            <w:pPr>
+              <w:jc w:val="both"/>
+              <w:rPr>
+                <w:rFonts w:ascii="Arial" w:hAnsi="Arial" w:cs="Arial"/>
+              </w:rPr>
+            </w:pPr>
+            <w:r>
+              <w:rPr>
+                <w:rFonts w:ascii="Arial" w:hAnsi="Arial" w:cs="Arial"/>
+              </w:rPr>
+              <w:t>Visualizar → Selecionar → Realizar</w:t>
+            </w:r>
+          </w:p>
+          <w:p>
+            <w:pPr>
+              <w:jc w:val="both"/>
+              <w:rPr>
+                <w:rFonts w:ascii="Arial" w:hAnsi="Arial" w:cs="Arial"/>
+              </w:rPr>
+            </w:pPr>
+          </w:p>
+          <w:p>
+            <w:pPr>
+              <w:jc w:val="both"/>
+              <w:rPr>
+                <w:rFonts w:ascii="Arial" w:hAnsi="Arial" w:cs="Arial"/>
+              </w:rPr>
+            </w:pPr>
+            <w:r>
+              <w:rPr>
+                <w:rFonts w:ascii="Arial" w:hAnsi="Arial" w:cs="Arial"/>
+              </w:rPr>
+              <w:t>O que é logicamente correto.</w:t>
+            </w:r>
+          </w:p>
+          <w:p>
+            <w:pPr>
+              <w:jc w:val="both"/>
+              <w:rPr>
+                <w:rFonts w:ascii="Arial" w:hAnsi="Arial" w:cs="Arial"/>
+              </w:rPr>
+            </w:pPr>
+          </w:p>
+          <w:p>
+            <w:pPr>
+              <w:jc w:val="both"/>
+              <w:rPr>
+                <w:rFonts w:ascii="Arial" w:hAnsi="Arial" w:cs="Arial"/>
+              </w:rPr>
+            </w:pPr>
+            <w:r>
+              <w:rPr>
+                <w:rFonts w:ascii="Arial" w:hAnsi="Arial" w:cs="Arial"/>
+              </w:rPr>
+              <w:t xml:space="preserve">Mas o teu diagrama, até agora, está modelando mais </w:t>
+            </w:r>
+            <w:r>
+              <w:rPr>
+                <w:rFonts w:ascii="Arial" w:hAnsi="Arial" w:cs="Arial"/>
+                <w:b/>
+                <w:bCs/>
+              </w:rPr>
+              <w:t>capacidades do sistema e interação dos atores</w:t>
+            </w:r>
+            <w:r>
+              <w:rPr>
+                <w:rFonts w:ascii="Arial" w:hAnsi="Arial" w:cs="Arial"/>
+              </w:rPr>
+              <w:t xml:space="preserve"> do que fluxo detalhado.</w:t>
+            </w:r>
+          </w:p>
+          <w:p>
+            <w:pPr>
+              <w:jc w:val="both"/>
+              <w:rPr>
+                <w:rFonts w:ascii="Arial" w:hAnsi="Arial" w:cs="Arial"/>
+              </w:rPr>
+            </w:pPr>
+          </w:p>
+          <w:p>
+            <w:pPr>
+              <w:jc w:val="both"/>
+              <w:rPr>
+                <w:rFonts w:ascii="Arial" w:hAnsi="Arial" w:cs="Arial"/>
+              </w:rPr>
+            </w:pPr>
+            <w:r>
+              <w:rPr>
+                <w:rFonts w:ascii="Arial" w:hAnsi="Arial" w:cs="Arial"/>
+              </w:rPr>
+              <w:t>Ou seja:</w:t>
+            </w:r>
+          </w:p>
+          <w:p>
+            <w:pPr>
+              <w:numPr>
+                <w:ilvl w:val="0"/>
+                <w:numId w:val="8"/>
+              </w:numPr>
+              <w:jc w:val="both"/>
+              <w:rPr>
+                <w:rFonts w:ascii="Arial" w:hAnsi="Arial" w:cs="Arial"/>
+              </w:rPr>
+            </w:pPr>
+            <w:r>
+              <w:rPr>
+                <w:rFonts w:ascii="Arial" w:hAnsi="Arial" w:cs="Arial"/>
+              </w:rPr>
+              <w:t xml:space="preserve">Cliente pode visualizar; </w:t>
+            </w:r>
+          </w:p>
+          <w:p>
+            <w:pPr>
+              <w:numPr>
+                <w:ilvl w:val="0"/>
+                <w:numId w:val="8"/>
+              </w:numPr>
+              <w:jc w:val="both"/>
+              <w:rPr>
+                <w:rFonts w:ascii="Arial" w:hAnsi="Arial" w:cs="Arial"/>
+              </w:rPr>
+            </w:pPr>
+            <w:r>
+              <w:rPr>
+                <w:rFonts w:ascii="Arial" w:hAnsi="Arial" w:cs="Arial"/>
+              </w:rPr>
+              <w:t xml:space="preserve">pode selecionar; </w:t>
+            </w:r>
+          </w:p>
+          <w:p>
+            <w:pPr>
+              <w:numPr>
+                <w:ilvl w:val="0"/>
+                <w:numId w:val="8"/>
+              </w:numPr>
+              <w:jc w:val="both"/>
+              <w:rPr>
+                <w:rFonts w:ascii="Arial" w:hAnsi="Arial" w:cs="Arial"/>
+              </w:rPr>
+            </w:pPr>
+            <w:r>
+              <w:rPr>
+                <w:rFonts w:ascii="Arial" w:hAnsi="Arial" w:cs="Arial"/>
+              </w:rPr>
+              <w:t xml:space="preserve">pode realizar pedido; </w:t>
+            </w:r>
+          </w:p>
+          <w:p>
+            <w:pPr>
+              <w:numPr>
+                <w:ilvl w:val="0"/>
+                <w:numId w:val="8"/>
+              </w:numPr>
+              <w:jc w:val="both"/>
+              <w:rPr>
+                <w:rFonts w:ascii="Arial" w:hAnsi="Arial" w:cs="Arial"/>
+              </w:rPr>
+            </w:pPr>
+            <w:r>
+              <w:rPr>
+                <w:rFonts w:ascii="Arial" w:hAnsi="Arial" w:cs="Arial"/>
+              </w:rPr>
+              <w:t xml:space="preserve">pode acompanhar. </w:t>
+            </w:r>
+          </w:p>
+          <w:p>
+            <w:pPr>
+              <w:jc w:val="both"/>
+              <w:rPr>
+                <w:rFonts w:ascii="Arial" w:hAnsi="Arial" w:cs="Arial"/>
+              </w:rPr>
+            </w:pPr>
+          </w:p>
+          <w:p>
+            <w:pPr>
+              <w:jc w:val="both"/>
+              <w:rPr>
+                <w:rFonts w:ascii="Arial" w:hAnsi="Arial" w:cs="Arial"/>
+              </w:rPr>
+            </w:pPr>
+            <w:r>
+              <w:rPr>
+                <w:rFonts w:ascii="Arial" w:hAnsi="Arial" w:cs="Arial"/>
+              </w:rPr>
+              <w:t>Isso deixa o diagrama:</w:t>
+            </w:r>
+          </w:p>
+          <w:p>
+            <w:pPr>
+              <w:numPr>
+                <w:ilvl w:val="0"/>
+                <w:numId w:val="9"/>
+              </w:numPr>
+              <w:jc w:val="both"/>
+              <w:rPr>
+                <w:rFonts w:ascii="Arial" w:hAnsi="Arial" w:cs="Arial"/>
+              </w:rPr>
+            </w:pPr>
+            <w:r>
+              <w:rPr>
+                <w:rFonts w:ascii="Arial" w:hAnsi="Arial" w:cs="Arial"/>
+              </w:rPr>
+              <w:t xml:space="preserve">mais limpo; </w:t>
+            </w:r>
+          </w:p>
+          <w:p>
+            <w:pPr>
+              <w:numPr>
+                <w:ilvl w:val="0"/>
+                <w:numId w:val="9"/>
+              </w:numPr>
+              <w:jc w:val="both"/>
+              <w:rPr>
+                <w:rFonts w:ascii="Arial" w:hAnsi="Arial" w:cs="Arial"/>
+              </w:rPr>
+            </w:pPr>
+            <w:r>
+              <w:rPr>
+                <w:rFonts w:ascii="Arial" w:hAnsi="Arial" w:cs="Arial"/>
+              </w:rPr>
+              <w:t xml:space="preserve">menos encadeado; </w:t>
+            </w:r>
+          </w:p>
+          <w:p>
+            <w:pPr>
+              <w:numPr>
+                <w:ilvl w:val="0"/>
+                <w:numId w:val="9"/>
+              </w:numPr>
+              <w:jc w:val="both"/>
+              <w:rPr>
+                <w:rFonts w:ascii="Arial" w:hAnsi="Arial" w:cs="Arial"/>
+              </w:rPr>
+            </w:pPr>
+            <w:r>
+              <w:rPr>
+                <w:rFonts w:ascii="Arial" w:hAnsi="Arial" w:cs="Arial"/>
+              </w:rPr>
+              <w:t xml:space="preserve">mais focado em responsabilidades. </w:t>
+            </w:r>
+          </w:p>
+          <w:p>
+            <w:pPr>
+              <w:jc w:val="both"/>
+              <w:rPr>
+                <w:rFonts w:ascii="Arial" w:hAnsi="Arial" w:cs="Arial"/>
+              </w:rPr>
+            </w:pPr>
+          </w:p>
+          <w:p>
+            <w:pPr>
+              <w:jc w:val="both"/>
+              <w:rPr>
+                <w:rFonts w:ascii="Arial" w:hAnsi="Arial" w:cs="Arial"/>
+              </w:rPr>
+            </w:pPr>
+            <w:r>
+              <w:rPr>
+                <w:rFonts w:ascii="Arial" w:hAnsi="Arial" w:cs="Arial"/>
+              </w:rPr>
+              <w:t>E tem um argumento bom a favor de não usar include aqui:</w:t>
+            </w:r>
+          </w:p>
+          <w:p>
+            <w:pPr>
+              <w:jc w:val="both"/>
+              <w:rPr>
+                <w:rFonts w:ascii="Arial" w:hAnsi="Arial" w:cs="Arial"/>
+              </w:rPr>
+            </w:pPr>
+          </w:p>
+          <w:p>
+            <w:pPr>
+              <w:jc w:val="both"/>
+              <w:rPr>
+                <w:rFonts w:ascii="Arial" w:hAnsi="Arial" w:cs="Arial"/>
+              </w:rPr>
+            </w:pPr>
+            <w:r>
+              <w:rPr>
+                <w:rFonts w:ascii="Arial" w:hAnsi="Arial" w:cs="Arial"/>
+              </w:rPr>
+              <w:t>"Selecionar Produtos" possui valor próprio e pode ocorrer sem que o pedido seja concluído.</w:t>
+            </w:r>
+          </w:p>
+          <w:p>
+            <w:pPr>
+              <w:jc w:val="both"/>
+              <w:rPr>
+                <w:rFonts w:ascii="Arial" w:hAnsi="Arial" w:cs="Arial"/>
+              </w:rPr>
+            </w:pPr>
+          </w:p>
+          <w:p>
+            <w:pPr>
+              <w:jc w:val="both"/>
+              <w:rPr>
+                <w:rFonts w:ascii="Arial" w:hAnsi="Arial" w:cs="Arial"/>
+              </w:rPr>
+            </w:pPr>
+            <w:r>
+              <w:rPr>
+                <w:rFonts w:ascii="Arial" w:hAnsi="Arial" w:cs="Arial"/>
+              </w:rPr>
+              <w:t>Então eu vejo assim:</w:t>
+            </w:r>
+          </w:p>
+          <w:p>
+            <w:pPr>
+              <w:jc w:val="both"/>
+              <w:rPr>
+                <w:rFonts w:ascii="Arial" w:hAnsi="Arial" w:cs="Arial"/>
+                <w:b/>
+                <w:bCs/>
+              </w:rPr>
+            </w:pPr>
+          </w:p>
+          <w:p>
+            <w:pPr>
+              <w:jc w:val="both"/>
+              <w:rPr>
+                <w:rFonts w:ascii="Arial" w:hAnsi="Arial" w:cs="Arial"/>
+                <w:b/>
+                <w:bCs/>
+              </w:rPr>
+            </w:pPr>
+            <w:r>
+              <w:rPr>
+                <w:rFonts w:ascii="Arial" w:hAnsi="Arial" w:cs="Arial"/>
+                <w:b/>
+                <w:bCs/>
+              </w:rPr>
+              <w:t>Com include</w:t>
+            </w:r>
+          </w:p>
+          <w:p>
+            <w:pPr>
+              <w:jc w:val="both"/>
+              <w:rPr>
+                <w:rFonts w:ascii="Arial" w:hAnsi="Arial" w:cs="Arial"/>
+              </w:rPr>
+            </w:pPr>
+            <w:r>
+              <w:rPr>
+                <w:rFonts w:ascii="Arial" w:hAnsi="Arial" w:cs="Arial"/>
+              </w:rPr>
+              <w:t>Mais processual / mais rígido.</w:t>
+            </w:r>
+          </w:p>
+          <w:p>
+            <w:pPr>
+              <w:jc w:val="both"/>
+              <w:rPr>
+                <w:rFonts w:ascii="Arial" w:hAnsi="Arial" w:cs="Arial"/>
+                <w:b/>
+                <w:bCs/>
+              </w:rPr>
+            </w:pPr>
+          </w:p>
+          <w:p>
+            <w:pPr>
+              <w:jc w:val="both"/>
+              <w:rPr>
+                <w:rFonts w:ascii="Arial" w:hAnsi="Arial" w:cs="Arial"/>
+                <w:b/>
+                <w:bCs/>
+              </w:rPr>
+            </w:pPr>
+            <w:r>
+              <w:rPr>
+                <w:rFonts w:ascii="Arial" w:hAnsi="Arial" w:cs="Arial"/>
+                <w:b/>
+                <w:bCs/>
+              </w:rPr>
+              <w:t>Sem include</w:t>
+            </w:r>
+          </w:p>
+          <w:p>
+            <w:pPr>
+              <w:jc w:val="both"/>
+              <w:rPr>
+                <w:rFonts w:ascii="Arial" w:hAnsi="Arial" w:cs="Arial"/>
+              </w:rPr>
+            </w:pPr>
+            <w:r>
+              <w:rPr>
+                <w:rFonts w:ascii="Arial" w:hAnsi="Arial" w:cs="Arial"/>
+              </w:rPr>
+              <w:t>Mais simples e orientado a funcionalidades.</w:t>
+            </w:r>
+          </w:p>
+          <w:p>
+            <w:pPr>
+              <w:jc w:val="both"/>
+              <w:rPr>
+                <w:rFonts w:ascii="Arial" w:hAnsi="Arial" w:cs="Arial"/>
+              </w:rPr>
+            </w:pPr>
+          </w:p>
+          <w:p>
+            <w:pPr>
+              <w:jc w:val="both"/>
+              <w:rPr>
+                <w:rFonts w:ascii="Arial" w:hAnsi="Arial" w:cs="Arial"/>
+              </w:rPr>
+            </w:pPr>
+            <w:r>
+              <w:rPr>
+                <w:rFonts w:ascii="Arial" w:hAnsi="Arial" w:cs="Arial"/>
+              </w:rPr>
+              <w:t xml:space="preserve">Para o </w:t>
+            </w:r>
+            <w:r>
+              <w:rPr>
+                <w:rFonts w:ascii="Arial" w:hAnsi="Arial" w:cs="Arial"/>
+                <w:b/>
+                <w:bCs/>
+              </w:rPr>
+              <w:t>teu diagrama atual</w:t>
+            </w:r>
+            <w:r>
+              <w:rPr>
+                <w:rFonts w:ascii="Arial" w:hAnsi="Arial" w:cs="Arial"/>
+              </w:rPr>
+              <w:t xml:space="preserve">, eu honestamente </w:t>
+            </w:r>
+            <w:r>
+              <w:rPr>
+                <w:rFonts w:ascii="Arial" w:hAnsi="Arial" w:cs="Arial"/>
+                <w:b/>
+                <w:bCs/>
+              </w:rPr>
+              <w:t>manteria sem</w:t>
+            </w:r>
+            <w:r>
+              <w:rPr>
+                <w:rFonts w:ascii="Arial" w:hAnsi="Arial" w:cs="Arial"/>
+              </w:rPr>
+              <w:t>.</w:t>
+            </w:r>
+          </w:p>
+          <w:p>
+            <w:pPr>
+              <w:jc w:val="both"/>
+              <w:rPr>
+                <w:rFonts w:ascii="Arial" w:hAnsi="Arial" w:cs="Arial"/>
+              </w:rPr>
+            </w:pPr>
           </w:p>
         </w:tc>
       </w:tr>
@@ -322,6 +1476,155 @@
 <file path=word/numbering.xml><?xml version="1.0" encoding="utf-8"?>
 <w:numbering xmlns:wpc="http://schemas.microsoft.com/office/word/2010/wordprocessingCanvas" xmlns:cx="http://schemas.microsoft.com/office/drawing/2014/chartex" xmlns:cx1="http://schemas.microsoft.com/office/drawing/2015/9/8/chartex" xmlns:cx2="http://schemas.microsoft.com/office/drawing/2015/10/21/chartex" xmlns:cx3="http://schemas.microsoft.com/office/drawing/2016/5/9/chartex" xmlns:cx4="http://schemas.microsoft.com/office/drawing/2016/5/10/chartex" xmlns:cx5="http://schemas.microsoft.com/office/drawing/2016/5/11/chartex" xmlns:cx6="http://schemas.microsoft.com/office/drawing/2016/5/12/chartex" xmlns:cx7="http://schemas.microsoft.com/office/drawing/2016/5/13/chartex" xmlns:cx8="http://schemas.microsoft.com/office/drawing/2016/5/14/chartex" xmlns:mc="http://schemas.openxmlformats.org/markup-compatibility/2006" xmlns:aink="http://schemas.microsoft.com/office/drawing/2016/ink" xmlns:am3d="http://schemas.microsoft.com/office/drawing/2017/model3d" xmlns:o="urn:schemas-microsoft-com:office:office" xmlns:oel="http://schemas.microsoft.com/office/2019/extlst" xmlns:r="http://schemas.openxmlformats.org/officeDocument/2006/relationships" xmlns:m="http://schemas.openxmlformats.org/officeDocument/2006/math" xmlns:v="urn:schemas-microsoft-com:vml" xmlns:wp14="http://schemas.microsoft.com/office/word/2010/wordprocessingDrawing" xmlns:wp="http://schemas.openxmlformats.org/drawingml/2006/wordprocessingDrawing" xmlns:w10="urn:schemas-microsoft-com:office:word" xmlns:w="http://schemas.openxmlformats.org/wordprocessingml/2006/main" xmlns:w14="http://schemas.microsoft.com/office/word/2010/wordml" xmlns:w15="http://schemas.microsoft.com/office/word/2012/wordml" xmlns:w16cex="http://schemas.microsoft.com/office/word/2018/wordml/cex" xmlns:w16cid="http://schemas.microsoft.com/office/word/2016/wordml/cid" xmlns:w16="http://schemas.microsoft.com/office/word/2018/wordml" xmlns:w16du="http://schemas.microsoft.com/office/word/2023/wordml/word16du" xmlns:w16sdtdh="http://schemas.microsoft.com/office/word/2020/wordml/sdtdatahash" xmlns:w16sdtfl="http://schemas.microsoft.com/office/word/2024/wordml/sdtformatlock" xmlns:w16se="http://schemas.microsoft.com/office/word/2015/wordml/symex" xmlns:wpg="http://schemas.microsoft.com/office/word/2010/wordprocessingGroup" xmlns:wpi="http://schemas.microsoft.com/office/word/2010/wordprocessingInk" xmlns:wne="http://schemas.microsoft.com/office/word/2006/wordml" xmlns:wps="http://schemas.microsoft.com/office/word/2010/wordprocessingShape" mc:Ignorable="w14 w15 w16se w16cid w16 w16cex w16sdtdh w16sdtfl w16du wp14">
   <w:abstractNum w:abstractNumId="0" w15:restartNumberingAfterBreak="0">
+    <w:nsid w:val="04E62441"/>
+    <w:multiLevelType w:val="multilevel"/>
+    <w:tmpl w:val="3754FCD6"/>
+    <w:lvl w:ilvl="0">
+      <w:start w:val="1"/>
+      <w:numFmt w:val="bullet"/>
+      <w:lvlText w:val=""/>
+      <w:lvlJc w:val="left"/>
+      <w:pPr>
+        <w:tabs>
+          <w:tab w:val="num" w:pos="720"/>
+        </w:tabs>
+        <w:ind w:left="720" w:hanging="360"/>
+      </w:pPr>
+      <w:rPr>
+        <w:rFonts w:ascii="Symbol" w:hAnsi="Symbol" w:hint="default"/>
+        <w:sz w:val="20"/>
+      </w:rPr>
+    </w:lvl>
+    <w:lvl w:ilvl="1" w:tentative="1">
+      <w:start w:val="1"/>
+      <w:numFmt w:val="bullet"/>
+      <w:lvlText w:val="o"/>
+      <w:lvlJc w:val="left"/>
+      <w:pPr>
+        <w:tabs>
+          <w:tab w:val="num" w:pos="1440"/>
+        </w:tabs>
+        <w:ind w:left="1440" w:hanging="360"/>
+      </w:pPr>
+      <w:rPr>
+        <w:rFonts w:ascii="Courier New" w:hAnsi="Courier New" w:hint="default"/>
+        <w:sz w:val="20"/>
+      </w:rPr>
+    </w:lvl>
+    <w:lvl w:ilvl="2" w:tentative="1">
+      <w:start w:val="1"/>
+      <w:numFmt w:val="bullet"/>
+      <w:lvlText w:val=""/>
+      <w:lvlJc w:val="left"/>
+      <w:pPr>
+        <w:tabs>
+          <w:tab w:val="num" w:pos="2160"/>
+        </w:tabs>
+        <w:ind w:left="2160" w:hanging="360"/>
+      </w:pPr>
+      <w:rPr>
+        <w:rFonts w:ascii="Wingdings" w:hAnsi="Wingdings" w:hint="default"/>
+        <w:sz w:val="20"/>
+      </w:rPr>
+    </w:lvl>
+    <w:lvl w:ilvl="3" w:tentative="1">
+      <w:start w:val="1"/>
+      <w:numFmt w:val="bullet"/>
+      <w:lvlText w:val=""/>
+      <w:lvlJc w:val="left"/>
+      <w:pPr>
+        <w:tabs>
+          <w:tab w:val="num" w:pos="2880"/>
+        </w:tabs>
+        <w:ind w:left="2880" w:hanging="360"/>
+      </w:pPr>
+      <w:rPr>
+        <w:rFonts w:ascii="Wingdings" w:hAnsi="Wingdings" w:hint="default"/>
+        <w:sz w:val="20"/>
+      </w:rPr>
+    </w:lvl>
+    <w:lvl w:ilvl="4" w:tentative="1">
+      <w:start w:val="1"/>
+      <w:numFmt w:val="bullet"/>
+      <w:lvlText w:val=""/>
+      <w:lvlJc w:val="left"/>
+      <w:pPr>
+        <w:tabs>
+          <w:tab w:val="num" w:pos="3600"/>
+        </w:tabs>
+        <w:ind w:left="3600" w:hanging="360"/>
+      </w:pPr>
+      <w:rPr>
+        <w:rFonts w:ascii="Wingdings" w:hAnsi="Wingdings" w:hint="default"/>
+        <w:sz w:val="20"/>
+      </w:rPr>
+    </w:lvl>
+    <w:lvl w:ilvl="5" w:tentative="1">
+      <w:start w:val="1"/>
+      <w:numFmt w:val="bullet"/>
+      <w:lvlText w:val=""/>
+      <w:lvlJc w:val="left"/>
+      <w:pPr>
+        <w:tabs>
+          <w:tab w:val="num" w:pos="4320"/>
+        </w:tabs>
+        <w:ind w:left="4320" w:hanging="360"/>
+      </w:pPr>
+      <w:rPr>
+        <w:rFonts w:ascii="Wingdings" w:hAnsi="Wingdings" w:hint="default"/>
+        <w:sz w:val="20"/>
+      </w:rPr>
+    </w:lvl>
+    <w:lvl w:ilvl="6" w:tentative="1">
+      <w:start w:val="1"/>
+      <w:numFmt w:val="bullet"/>
+      <w:lvlText w:val=""/>
+      <w:lvlJc w:val="left"/>
+      <w:pPr>
+        <w:tabs>
+          <w:tab w:val="num" w:pos="5040"/>
+        </w:tabs>
+        <w:ind w:left="5040" w:hanging="360"/>
+      </w:pPr>
+      <w:rPr>
+        <w:rFonts w:ascii="Wingdings" w:hAnsi="Wingdings" w:hint="default"/>
+        <w:sz w:val="20"/>
+      </w:rPr>
+    </w:lvl>
+    <w:lvl w:ilvl="7" w:tentative="1">
+      <w:start w:val="1"/>
+      <w:numFmt w:val="bullet"/>
+      <w:lvlText w:val=""/>
+      <w:lvlJc w:val="left"/>
+      <w:pPr>
+        <w:tabs>
+          <w:tab w:val="num" w:pos="5760"/>
+        </w:tabs>
+        <w:ind w:left="5760" w:hanging="360"/>
+      </w:pPr>
+      <w:rPr>
+        <w:rFonts w:ascii="Wingdings" w:hAnsi="Wingdings" w:hint="default"/>
+        <w:sz w:val="20"/>
+      </w:rPr>
+    </w:lvl>
+    <w:lvl w:ilvl="8" w:tentative="1">
+      <w:start w:val="1"/>
+      <w:numFmt w:val="bullet"/>
+      <w:lvlText w:val=""/>
+      <w:lvlJc w:val="left"/>
+      <w:pPr>
+        <w:tabs>
+          <w:tab w:val="num" w:pos="6480"/>
+        </w:tabs>
+        <w:ind w:left="6480" w:hanging="360"/>
+      </w:pPr>
+      <w:rPr>
+        <w:rFonts w:ascii="Wingdings" w:hAnsi="Wingdings" w:hint="default"/>
+        <w:sz w:val="20"/>
+      </w:rPr>
+    </w:lvl>
+  </w:abstractNum>
+  <w:abstractNum w:abstractNumId="1" w15:restartNumberingAfterBreak="0">
     <w:nsid w:val="08A85488"/>
     <w:multiLevelType w:val="multilevel"/>
     <w:tmpl w:val="779069A4"/>
@@ -470,7 +1773,7 @@
       </w:rPr>
     </w:lvl>
   </w:abstractNum>
-  <w:abstractNum w:abstractNumId="1" w15:restartNumberingAfterBreak="0">
+  <w:abstractNum w:abstractNumId="2" w15:restartNumberingAfterBreak="0">
     <w:nsid w:val="119B0DD2"/>
     <w:multiLevelType w:val="multilevel"/>
     <w:tmpl w:val="A5BE1CB0"/>
@@ -619,7 +1922,156 @@
       </w:rPr>
     </w:lvl>
   </w:abstractNum>
-  <w:abstractNum w:abstractNumId="2" w15:restartNumberingAfterBreak="0">
+  <w:abstractNum w:abstractNumId="3" w15:restartNumberingAfterBreak="0">
+    <w:nsid w:val="1E3B76B7"/>
+    <w:multiLevelType w:val="multilevel"/>
+    <w:tmpl w:val="3D822BB0"/>
+    <w:lvl w:ilvl="0">
+      <w:start w:val="1"/>
+      <w:numFmt w:val="bullet"/>
+      <w:lvlText w:val=""/>
+      <w:lvlJc w:val="left"/>
+      <w:pPr>
+        <w:tabs>
+          <w:tab w:val="num" w:pos="720"/>
+        </w:tabs>
+        <w:ind w:left="720" w:hanging="360"/>
+      </w:pPr>
+      <w:rPr>
+        <w:rFonts w:ascii="Symbol" w:hAnsi="Symbol" w:hint="default"/>
+        <w:sz w:val="20"/>
+      </w:rPr>
+    </w:lvl>
+    <w:lvl w:ilvl="1" w:tentative="1">
+      <w:start w:val="1"/>
+      <w:numFmt w:val="bullet"/>
+      <w:lvlText w:val="o"/>
+      <w:lvlJc w:val="left"/>
+      <w:pPr>
+        <w:tabs>
+          <w:tab w:val="num" w:pos="1440"/>
+        </w:tabs>
+        <w:ind w:left="1440" w:hanging="360"/>
+      </w:pPr>
+      <w:rPr>
+        <w:rFonts w:ascii="Courier New" w:hAnsi="Courier New" w:hint="default"/>
+        <w:sz w:val="20"/>
+      </w:rPr>
+    </w:lvl>
+    <w:lvl w:ilvl="2" w:tentative="1">
+      <w:start w:val="1"/>
+      <w:numFmt w:val="bullet"/>
+      <w:lvlText w:val=""/>
+      <w:lvlJc w:val="left"/>
+      <w:pPr>
+        <w:tabs>
+          <w:tab w:val="num" w:pos="2160"/>
+        </w:tabs>
+        <w:ind w:left="2160" w:hanging="360"/>
+      </w:pPr>
+      <w:rPr>
+        <w:rFonts w:ascii="Wingdings" w:hAnsi="Wingdings" w:hint="default"/>
+        <w:sz w:val="20"/>
+      </w:rPr>
+    </w:lvl>
+    <w:lvl w:ilvl="3" w:tentative="1">
+      <w:start w:val="1"/>
+      <w:numFmt w:val="bullet"/>
+      <w:lvlText w:val=""/>
+      <w:lvlJc w:val="left"/>
+      <w:pPr>
+        <w:tabs>
+          <w:tab w:val="num" w:pos="2880"/>
+        </w:tabs>
+        <w:ind w:left="2880" w:hanging="360"/>
+      </w:pPr>
+      <w:rPr>
+        <w:rFonts w:ascii="Wingdings" w:hAnsi="Wingdings" w:hint="default"/>
+        <w:sz w:val="20"/>
+      </w:rPr>
+    </w:lvl>
+    <w:lvl w:ilvl="4" w:tentative="1">
+      <w:start w:val="1"/>
+      <w:numFmt w:val="bullet"/>
+      <w:lvlText w:val=""/>
+      <w:lvlJc w:val="left"/>
+      <w:pPr>
+        <w:tabs>
+          <w:tab w:val="num" w:pos="3600"/>
+        </w:tabs>
+        <w:ind w:left="3600" w:hanging="360"/>
+      </w:pPr>
+      <w:rPr>
+        <w:rFonts w:ascii="Wingdings" w:hAnsi="Wingdings" w:hint="default"/>
+        <w:sz w:val="20"/>
+      </w:rPr>
+    </w:lvl>
+    <w:lvl w:ilvl="5" w:tentative="1">
+      <w:start w:val="1"/>
+      <w:numFmt w:val="bullet"/>
+      <w:lvlText w:val=""/>
+      <w:lvlJc w:val="left"/>
+      <w:pPr>
+        <w:tabs>
+          <w:tab w:val="num" w:pos="4320"/>
+        </w:tabs>
+        <w:ind w:left="4320" w:hanging="360"/>
+      </w:pPr>
+      <w:rPr>
+        <w:rFonts w:ascii="Wingdings" w:hAnsi="Wingdings" w:hint="default"/>
+        <w:sz w:val="20"/>
+      </w:rPr>
+    </w:lvl>
+    <w:lvl w:ilvl="6" w:tentative="1">
+      <w:start w:val="1"/>
+      <w:numFmt w:val="bullet"/>
+      <w:lvlText w:val=""/>
+      <w:lvlJc w:val="left"/>
+      <w:pPr>
+        <w:tabs>
+          <w:tab w:val="num" w:pos="5040"/>
+        </w:tabs>
+        <w:ind w:left="5040" w:hanging="360"/>
+      </w:pPr>
+      <w:rPr>
+        <w:rFonts w:ascii="Wingdings" w:hAnsi="Wingdings" w:hint="default"/>
+        <w:sz w:val="20"/>
+      </w:rPr>
+    </w:lvl>
+    <w:lvl w:ilvl="7" w:tentative="1">
+      <w:start w:val="1"/>
+      <w:numFmt w:val="bullet"/>
+      <w:lvlText w:val=""/>
+      <w:lvlJc w:val="left"/>
+      <w:pPr>
+        <w:tabs>
+          <w:tab w:val="num" w:pos="5760"/>
+        </w:tabs>
+        <w:ind w:left="5760" w:hanging="360"/>
+      </w:pPr>
+      <w:rPr>
+        <w:rFonts w:ascii="Wingdings" w:hAnsi="Wingdings" w:hint="default"/>
+        <w:sz w:val="20"/>
+      </w:rPr>
+    </w:lvl>
+    <w:lvl w:ilvl="8" w:tentative="1">
+      <w:start w:val="1"/>
+      <w:numFmt w:val="bullet"/>
+      <w:lvlText w:val=""/>
+      <w:lvlJc w:val="left"/>
+      <w:pPr>
+        <w:tabs>
+          <w:tab w:val="num" w:pos="6480"/>
+        </w:tabs>
+        <w:ind w:left="6480" w:hanging="360"/>
+      </w:pPr>
+      <w:rPr>
+        <w:rFonts w:ascii="Wingdings" w:hAnsi="Wingdings" w:hint="default"/>
+        <w:sz w:val="20"/>
+      </w:rPr>
+    </w:lvl>
+  </w:abstractNum>
+  <w:abstractNum w:abstractNumId="4" w15:restartNumberingAfterBreak="0">
     <w:nsid w:val="261F2705"/>
     <w:multiLevelType w:val="multilevel"/>
     <w:tmpl w:val="298427E8"/>
@@ -768,7 +2220,7 @@
       </w:rPr>
     </w:lvl>
   </w:abstractNum>
-  <w:abstractNum w:abstractNumId="3" w15:restartNumberingAfterBreak="0">
+  <w:abstractNum w:abstractNumId="5" w15:restartNumberingAfterBreak="0">
     <w:nsid w:val="34DD459E"/>
     <w:multiLevelType w:val="multilevel"/>
     <w:tmpl w:val="0EF29FA0"/>
@@ -917,7 +2369,156 @@
       </w:rPr>
     </w:lvl>
   </w:abstractNum>
-  <w:abstractNum w:abstractNumId="4" w15:restartNumberingAfterBreak="0">
+  <w:abstractNum w:abstractNumId="6" w15:restartNumberingAfterBreak="0">
+    <w:nsid w:val="467B2E63"/>
+    <w:multiLevelType w:val="multilevel"/>
+    <w:tmpl w:val="A9907E4C"/>
+    <w:lvl w:ilvl="0">
+      <w:start w:val="1"/>
+      <w:numFmt w:val="bullet"/>
+      <w:lvlText w:val=""/>
+      <w:lvlJc w:val="left"/>
+      <w:pPr>
+        <w:tabs>
+          <w:tab w:val="num" w:pos="720"/>
+        </w:tabs>
+        <w:ind w:left="720" w:hanging="360"/>
+      </w:pPr>
+      <w:rPr>
+        <w:rFonts w:ascii="Symbol" w:hAnsi="Symbol" w:hint="default"/>
+        <w:sz w:val="20"/>
+      </w:rPr>
+    </w:lvl>
+    <w:lvl w:ilvl="1" w:tentative="1">
+      <w:start w:val="1"/>
+      <w:numFmt w:val="bullet"/>
+      <w:lvlText w:val="o"/>
+      <w:lvlJc w:val="left"/>
+      <w:pPr>
+        <w:tabs>
+          <w:tab w:val="num" w:pos="1440"/>
+        </w:tabs>
+        <w:ind w:left="1440" w:hanging="360"/>
+      </w:pPr>
+      <w:rPr>
+        <w:rFonts w:ascii="Courier New" w:hAnsi="Courier New" w:hint="default"/>
+        <w:sz w:val="20"/>
+      </w:rPr>
+    </w:lvl>
+    <w:lvl w:ilvl="2" w:tentative="1">
+      <w:start w:val="1"/>
+      <w:numFmt w:val="bullet"/>
+      <w:lvlText w:val=""/>
+      <w:lvlJc w:val="left"/>
+      <w:pPr>
+        <w:tabs>
+          <w:tab w:val="num" w:pos="2160"/>
+        </w:tabs>
+        <w:ind w:left="2160" w:hanging="360"/>
+      </w:pPr>
+      <w:rPr>
+        <w:rFonts w:ascii="Wingdings" w:hAnsi="Wingdings" w:hint="default"/>
+        <w:sz w:val="20"/>
+      </w:rPr>
+    </w:lvl>
+    <w:lvl w:ilvl="3" w:tentative="1">
+      <w:start w:val="1"/>
+      <w:numFmt w:val="bullet"/>
+      <w:lvlText w:val=""/>
+      <w:lvlJc w:val="left"/>
+      <w:pPr>
+        <w:tabs>
+          <w:tab w:val="num" w:pos="2880"/>
+        </w:tabs>
+        <w:ind w:left="2880" w:hanging="360"/>
+      </w:pPr>
+      <w:rPr>
+        <w:rFonts w:ascii="Wingdings" w:hAnsi="Wingdings" w:hint="default"/>
+        <w:sz w:val="20"/>
+      </w:rPr>
+    </w:lvl>
+    <w:lvl w:ilvl="4" w:tentative="1">
+      <w:start w:val="1"/>
+      <w:numFmt w:val="bullet"/>
+      <w:lvlText w:val=""/>
+      <w:lvlJc w:val="left"/>
+      <w:pPr>
+        <w:tabs>
+          <w:tab w:val="num" w:pos="3600"/>
+        </w:tabs>
+        <w:ind w:left="3600" w:hanging="360"/>
+      </w:pPr>
+      <w:rPr>
+        <w:rFonts w:ascii="Wingdings" w:hAnsi="Wingdings" w:hint="default"/>
+        <w:sz w:val="20"/>
+      </w:rPr>
+    </w:lvl>
+    <w:lvl w:ilvl="5" w:tentative="1">
+      <w:start w:val="1"/>
+      <w:numFmt w:val="bullet"/>
+      <w:lvlText w:val=""/>
+      <w:lvlJc w:val="left"/>
+      <w:pPr>
+        <w:tabs>
+          <w:tab w:val="num" w:pos="4320"/>
+        </w:tabs>
+        <w:ind w:left="4320" w:hanging="360"/>
+      </w:pPr>
+      <w:rPr>
+        <w:rFonts w:ascii="Wingdings" w:hAnsi="Wingdings" w:hint="default"/>
+        <w:sz w:val="20"/>
+      </w:rPr>
+    </w:lvl>
+    <w:lvl w:ilvl="6" w:tentative="1">
+      <w:start w:val="1"/>
+      <w:numFmt w:val="bullet"/>
+      <w:lvlText w:val=""/>
+      <w:lvlJc w:val="left"/>
+      <w:pPr>
+        <w:tabs>
+          <w:tab w:val="num" w:pos="5040"/>
+        </w:tabs>
+        <w:ind w:left="5040" w:hanging="360"/>
+      </w:pPr>
+      <w:rPr>
+        <w:rFonts w:ascii="Wingdings" w:hAnsi="Wingdings" w:hint="default"/>
+        <w:sz w:val="20"/>
+      </w:rPr>
+    </w:lvl>
+    <w:lvl w:ilvl="7" w:tentative="1">
+      <w:start w:val="1"/>
+      <w:numFmt w:val="bullet"/>
+      <w:lvlText w:val=""/>
+      <w:lvlJc w:val="left"/>
+      <w:pPr>
+        <w:tabs>
+          <w:tab w:val="num" w:pos="5760"/>
+        </w:tabs>
+        <w:ind w:left="5760" w:hanging="360"/>
+      </w:pPr>
+      <w:rPr>
+        <w:rFonts w:ascii="Wingdings" w:hAnsi="Wingdings" w:hint="default"/>
+        <w:sz w:val="20"/>
+      </w:rPr>
+    </w:lvl>
+    <w:lvl w:ilvl="8" w:tentative="1">
+      <w:start w:val="1"/>
+      <w:numFmt w:val="bullet"/>
+      <w:lvlText w:val=""/>
+      <w:lvlJc w:val="left"/>
+      <w:pPr>
+        <w:tabs>
+          <w:tab w:val="num" w:pos="6480"/>
+        </w:tabs>
+        <w:ind w:left="6480" w:hanging="360"/>
+      </w:pPr>
+      <w:rPr>
+        <w:rFonts w:ascii="Wingdings" w:hAnsi="Wingdings" w:hint="default"/>
+        <w:sz w:val="20"/>
+      </w:rPr>
+    </w:lvl>
+  </w:abstractNum>
+  <w:abstractNum w:abstractNumId="7" w15:restartNumberingAfterBreak="0">
     <w:nsid w:val="7E2649F0"/>
     <w:multiLevelType w:val="multilevel"/>
     <w:tmpl w:val="7434612E"/>
@@ -1030,7 +2631,7 @@
       </w:pPr>
     </w:lvl>
   </w:abstractNum>
-  <w:abstractNum w:abstractNumId="5" w15:restartNumberingAfterBreak="0">
+  <w:abstractNum w:abstractNumId="8" w15:restartNumberingAfterBreak="0">
     <w:nsid w:val="7F0528D8"/>
     <w:multiLevelType w:val="multilevel"/>
     <w:tmpl w:val="35208C6C"/>
@@ -1180,22 +2781,31 @@
     </w:lvl>
   </w:abstractNum>
   <w:num w:numId="1" w16cid:durableId="680281724">
+    <w:abstractNumId w:val="4"/>
+  </w:num>
+  <w:num w:numId="2" w16cid:durableId="430125252">
+    <w:abstractNumId w:val="5"/>
+  </w:num>
+  <w:num w:numId="3" w16cid:durableId="1915048351">
     <w:abstractNumId w:val="2"/>
   </w:num>
-  <w:num w:numId="2" w16cid:durableId="430125252">
+  <w:num w:numId="4" w16cid:durableId="123276942">
+    <w:abstractNumId w:val="1"/>
+  </w:num>
+  <w:num w:numId="5" w16cid:durableId="933589539">
+    <w:abstractNumId w:val="8"/>
+  </w:num>
+  <w:num w:numId="6" w16cid:durableId="1541436777">
+    <w:abstractNumId w:val="7"/>
+  </w:num>
+  <w:num w:numId="7" w16cid:durableId="1496067726">
+    <w:abstractNumId w:val="6"/>
+  </w:num>
+  <w:num w:numId="8" w16cid:durableId="961570926">
     <w:abstractNumId w:val="3"/>
   </w:num>
-  <w:num w:numId="3" w16cid:durableId="1915048351">
-    <w:abstractNumId w:val="1"/>
-  </w:num>
-  <w:num w:numId="4" w16cid:durableId="123276942">
+  <w:num w:numId="9" w16cid:durableId="507989054">
     <w:abstractNumId w:val="0"/>
-  </w:num>
-  <w:num w:numId="5" w16cid:durableId="933589539">
-    <w:abstractNumId w:val="5"/>
-  </w:num>
-  <w:num w:numId="6" w16cid:durableId="1541436777">
-    <w:abstractNumId w:val="4"/>
   </w:num>
 </w:numbering>
 </file>

</xml_diff>

<commit_message>
Adicionar nova consulta (prompt) ao documento sobre IAs
</commit_message>
<xml_diff>
--- a/docs/prompts-ia.docx
+++ b/docs/prompts-ia.docx
@@ -202,10 +202,10 @@
                   <v:path o:extrusionok="f" gradientshapeok="t" o:connecttype="rect"/>
                   <o:lock v:ext="edit" aspectratio="t"/>
                 </v:shapetype>
-                <v:shape id="_x0000_i1126" type="#_x0000_t75" style="width:77.25pt;height:49.5pt" o:ole="">
+                <v:shape id="_x0000_i1145" type="#_x0000_t75" style="width:77.25pt;height:49.5pt" o:ole="">
                   <v:imagedata r:id="rId5" o:title=""/>
                 </v:shape>
-                <o:OLEObject Type="Embed" ProgID="Package" ShapeID="_x0000_i1126" DrawAspect="Icon" ObjectID="_1841929542" r:id="rId6"/>
+                <o:OLEObject Type="Embed" ProgID="Package" ShapeID="_x0000_i1145" DrawAspect="Icon" ObjectID="_1841944626" r:id="rId6"/>
               </w:object>
             </w:r>
             <w:r>
@@ -213,10 +213,10 @@
                 <w:rFonts w:ascii="Arial" w:hAnsi="Arial" w:cs="Arial"/>
               </w:rPr>
               <w:object w:dxaOrig="1539" w:dyaOrig="997" w14:anchorId="4792A0E5">
-                <v:shape id="_x0000_i1127" type="#_x0000_t75" style="width:77.25pt;height:49.5pt" o:ole="">
+                <v:shape id="_x0000_i1146" type="#_x0000_t75" style="width:77.25pt;height:49.5pt" o:ole="">
                   <v:imagedata r:id="rId7" o:title=""/>
                 </v:shape>
-                <o:OLEObject Type="Embed" ProgID="Package" ShapeID="_x0000_i1127" DrawAspect="Icon" ObjectID="_1841929543" r:id="rId8"/>
+                <o:OLEObject Type="Embed" ProgID="Package" ShapeID="_x0000_i1146" DrawAspect="Icon" ObjectID="_1841944627" r:id="rId8"/>
               </w:object>
             </w:r>
           </w:p>
@@ -392,7 +392,7 @@
                 <w:noProof/>
               </w:rPr>
               <w:drawing>
-                <wp:inline distT="0" distB="0" distL="0" distR="0" wp14:anchorId="5DDFAD39" wp14:editId="30C9FAA0">
+                <wp:inline distT="0" distB="0" distL="0" distR="0" wp14:anchorId="5DDFAD39" wp14:editId="7DE63D40">
                   <wp:extent cx="740370" cy="866775"/>
                   <wp:effectExtent l="0" t="0" r="3175" b="0"/>
                   <wp:docPr id="266258332" name="Imagem 3"/>
@@ -424,7 +424,7 @@
                         <pic:spPr bwMode="auto">
                           <a:xfrm>
                             <a:off x="0" y="0"/>
-                            <a:ext cx="747121" cy="874679"/>
+                            <a:ext cx="740370" cy="866775"/>
                           </a:xfrm>
                           <a:prstGeom prst="rect">
                             <a:avLst/>
@@ -445,10 +445,10 @@
                 <w:rFonts w:ascii="Arial" w:hAnsi="Arial" w:cs="Arial"/>
               </w:rPr>
               <w:object w:dxaOrig="1539" w:dyaOrig="997" w14:anchorId="5DA42E4A">
-                <v:shape id="_x0000_i1132" type="#_x0000_t75" style="width:77.25pt;height:49.5pt" o:ole="">
+                <v:shape id="_x0000_i1147" type="#_x0000_t75" style="width:77.25pt;height:49.5pt" o:ole="">
                   <v:imagedata r:id="rId10" o:title=""/>
                 </v:shape>
-                <o:OLEObject Type="Embed" ProgID="Package" ShapeID="_x0000_i1132" DrawAspect="Icon" ObjectID="_1841929544" r:id="rId11"/>
+                <o:OLEObject Type="Embed" ProgID="Package" ShapeID="_x0000_i1147" DrawAspect="Icon" ObjectID="_1841944628" r:id="rId11"/>
               </w:object>
             </w:r>
           </w:p>
@@ -1437,6 +1437,279 @@
                 <w:bCs/>
               </w:rPr>
               <w:t>manteria sem</w:t>
+            </w:r>
+            <w:r>
+              <w:rPr>
+                <w:rFonts w:ascii="Arial" w:hAnsi="Arial" w:cs="Arial"/>
+              </w:rPr>
+              <w:t>.</w:t>
+            </w:r>
+          </w:p>
+          <w:p>
+            <w:pPr>
+              <w:jc w:val="both"/>
+              <w:rPr>
+                <w:rFonts w:ascii="Arial" w:hAnsi="Arial" w:cs="Arial"/>
+              </w:rPr>
+            </w:pPr>
+          </w:p>
+        </w:tc>
+      </w:tr>
+      <w:tr>
+        <w:tc>
+          <w:tcPr>
+            <w:tcW w:w="1524" w:type="dxa"/>
+          </w:tcPr>
+          <w:p>
+            <w:pPr>
+              <w:jc w:val="center"/>
+              <w:rPr>
+                <w:rFonts w:ascii="Arial" w:hAnsi="Arial" w:cs="Arial"/>
+              </w:rPr>
+            </w:pPr>
+            <w:r>
+              <w:rPr>
+                <w:rFonts w:ascii="Arial" w:hAnsi="Arial" w:cs="Arial"/>
+              </w:rPr>
+              <w:t>ChatGPT</w:t>
+            </w:r>
+          </w:p>
+        </w:tc>
+        <w:tc>
+          <w:tcPr>
+            <w:tcW w:w="1650" w:type="dxa"/>
+          </w:tcPr>
+          <w:p>
+            <w:pPr>
+              <w:jc w:val="both"/>
+              <w:rPr>
+                <w:rFonts w:ascii="Arial" w:hAnsi="Arial" w:cs="Arial"/>
+              </w:rPr>
+            </w:pPr>
+            <w:r>
+              <w:rPr>
+                <w:rFonts w:ascii="Arial" w:hAnsi="Arial" w:cs="Arial"/>
+              </w:rPr>
+              <w:t>Aprender sobre Diagramas de Jornada de Usuário.</w:t>
+            </w:r>
+          </w:p>
+        </w:tc>
+        <w:tc>
+          <w:tcPr>
+            <w:tcW w:w="3514" w:type="dxa"/>
+          </w:tcPr>
+          <w:p>
+            <w:pPr>
+              <w:jc w:val="both"/>
+              <w:rPr>
+                <w:rFonts w:ascii="Arial" w:hAnsi="Arial" w:cs="Arial"/>
+                <w:color w:val="A6A6A6" w:themeColor="background1" w:themeShade="A6"/>
+                <w:sz w:val="20"/>
+                <w:szCs w:val="20"/>
+              </w:rPr>
+            </w:pPr>
+            <w:r>
+              <w:rPr>
+                <w:rFonts w:ascii="Arial" w:hAnsi="Arial" w:cs="Arial"/>
+                <w:color w:val="A6A6A6" w:themeColor="background1" w:themeShade="A6"/>
+                <w:sz w:val="20"/>
+                <w:szCs w:val="20"/>
+              </w:rPr>
+              <w:t xml:space="preserve">Nome do chat: </w:t>
+            </w:r>
+            <w:r>
+              <w:rPr>
+                <w:rFonts w:ascii="Arial" w:hAnsi="Arial" w:cs="Arial"/>
+                <w:color w:val="A6A6A6" w:themeColor="background1" w:themeShade="A6"/>
+                <w:sz w:val="20"/>
+                <w:szCs w:val="20"/>
+              </w:rPr>
+              <w:t>Ajuda com Projeto</w:t>
+            </w:r>
+          </w:p>
+          <w:p>
+            <w:pPr>
+              <w:jc w:val="both"/>
+              <w:rPr>
+                <w:rFonts w:ascii="Arial" w:hAnsi="Arial" w:cs="Arial"/>
+                <w:color w:val="A6A6A6" w:themeColor="background1" w:themeShade="A6"/>
+                <w:sz w:val="20"/>
+                <w:szCs w:val="20"/>
+              </w:rPr>
+            </w:pPr>
+          </w:p>
+          <w:p>
+            <w:pPr>
+              <w:jc w:val="both"/>
+              <w:rPr>
+                <w:rFonts w:ascii="Arial" w:hAnsi="Arial" w:cs="Arial"/>
+                <w:color w:val="000000" w:themeColor="text1"/>
+              </w:rPr>
+            </w:pPr>
+            <w:r>
+              <w:rPr>
+                <w:rFonts w:ascii="Arial" w:hAnsi="Arial" w:cs="Arial"/>
+                <w:color w:val="000000" w:themeColor="text1"/>
+              </w:rPr>
+              <w:t>O que é um Diagrama da Jornada do Usuário?</w:t>
+            </w:r>
+          </w:p>
+        </w:tc>
+        <w:tc>
+          <w:tcPr>
+            <w:tcW w:w="3768" w:type="dxa"/>
+          </w:tcPr>
+          <w:p>
+            <w:pPr>
+              <w:jc w:val="both"/>
+              <w:rPr>
+                <w:rFonts w:ascii="Arial" w:hAnsi="Arial" w:cs="Arial"/>
+              </w:rPr>
+            </w:pPr>
+            <w:r>
+              <w:rPr>
+                <w:rFonts w:ascii="Arial" w:hAnsi="Arial" w:cs="Arial"/>
+              </w:rPr>
+              <w:t>Em termos simples:</w:t>
+            </w:r>
+          </w:p>
+          <w:p>
+            <w:pPr>
+              <w:jc w:val="both"/>
+              <w:rPr>
+                <w:rFonts w:ascii="Arial" w:hAnsi="Arial" w:cs="Arial"/>
+              </w:rPr>
+            </w:pPr>
+          </w:p>
+          <w:p>
+            <w:pPr>
+              <w:jc w:val="both"/>
+              <w:rPr>
+                <w:rFonts w:ascii="Arial" w:hAnsi="Arial" w:cs="Arial"/>
+              </w:rPr>
+            </w:pPr>
+            <w:r>
+              <w:rPr>
+                <w:rFonts w:ascii="Arial" w:hAnsi="Arial" w:cs="Arial"/>
+                <w:b/>
+                <w:bCs/>
+              </w:rPr>
+              <w:t>Diagrama da Jornada do Usuário (User Journey Diagram)</w:t>
+            </w:r>
+            <w:r>
+              <w:rPr>
+                <w:rFonts w:ascii="Arial" w:hAnsi="Arial" w:cs="Arial"/>
+              </w:rPr>
+              <w:t xml:space="preserve"> é um diagrama que mostra </w:t>
+            </w:r>
+            <w:r>
+              <w:rPr>
+                <w:rFonts w:ascii="Arial" w:hAnsi="Arial" w:cs="Arial"/>
+                <w:b/>
+                <w:bCs/>
+              </w:rPr>
+              <w:t>o percurso do usuário ao interagir com o sistema</w:t>
+            </w:r>
+            <w:r>
+              <w:rPr>
+                <w:rFonts w:ascii="Arial" w:hAnsi="Arial" w:cs="Arial"/>
+              </w:rPr>
+              <w:t>, passo a passo, desde o início até o objetivo final.</w:t>
+            </w:r>
+          </w:p>
+          <w:p>
+            <w:pPr>
+              <w:jc w:val="both"/>
+              <w:rPr>
+                <w:rFonts w:ascii="Arial" w:hAnsi="Arial" w:cs="Arial"/>
+              </w:rPr>
+            </w:pPr>
+          </w:p>
+          <w:p>
+            <w:pPr>
+              <w:jc w:val="both"/>
+              <w:rPr>
+                <w:rFonts w:ascii="Arial" w:hAnsi="Arial" w:cs="Arial"/>
+              </w:rPr>
+            </w:pPr>
+            <w:r>
+              <w:rPr>
+                <w:rFonts w:ascii="Arial" w:hAnsi="Arial" w:cs="Arial"/>
+              </w:rPr>
+              <w:lastRenderedPageBreak/>
+              <w:t>Ele responde:</w:t>
+            </w:r>
+          </w:p>
+          <w:p>
+            <w:pPr>
+              <w:jc w:val="both"/>
+              <w:rPr>
+                <w:rFonts w:ascii="Arial" w:hAnsi="Arial" w:cs="Arial"/>
+              </w:rPr>
+            </w:pPr>
+          </w:p>
+          <w:p>
+            <w:pPr>
+              <w:jc w:val="both"/>
+              <w:rPr>
+                <w:rFonts w:ascii="Arial" w:hAnsi="Arial" w:cs="Arial"/>
+              </w:rPr>
+            </w:pPr>
+            <w:r>
+              <w:rPr>
+                <w:rFonts w:ascii="Arial" w:hAnsi="Arial" w:cs="Arial"/>
+              </w:rPr>
+              <w:t>"Como o cliente passa pelo sistema e o que acontece em cada etapa?"</w:t>
+            </w:r>
+          </w:p>
+          <w:p>
+            <w:pPr>
+              <w:jc w:val="both"/>
+              <w:rPr>
+                <w:rFonts w:ascii="Arial" w:hAnsi="Arial" w:cs="Arial"/>
+              </w:rPr>
+            </w:pPr>
+            <w:r>
+              <w:rPr>
+                <w:rFonts w:ascii="Arial" w:hAnsi="Arial" w:cs="Arial"/>
+              </w:rPr>
+              <w:t xml:space="preserve">Diferente do </w:t>
+            </w:r>
+            <w:r>
+              <w:rPr>
+                <w:rFonts w:ascii="Arial" w:hAnsi="Arial" w:cs="Arial"/>
+                <w:b/>
+                <w:bCs/>
+              </w:rPr>
+              <w:t>Caso de Uso</w:t>
+            </w:r>
+            <w:r>
+              <w:rPr>
+                <w:rFonts w:ascii="Arial" w:hAnsi="Arial" w:cs="Arial"/>
+              </w:rPr>
+              <w:t xml:space="preserve">, que mostra </w:t>
+            </w:r>
+            <w:r>
+              <w:rPr>
+                <w:rFonts w:ascii="Arial" w:hAnsi="Arial" w:cs="Arial"/>
+                <w:b/>
+                <w:bCs/>
+              </w:rPr>
+              <w:t>funcionalidades e relações</w:t>
+            </w:r>
+            <w:r>
+              <w:rPr>
+                <w:rFonts w:ascii="Arial" w:hAnsi="Arial" w:cs="Arial"/>
+              </w:rPr>
+              <w:t xml:space="preserve">, a jornada mostra </w:t>
+            </w:r>
+            <w:r>
+              <w:rPr>
+                <w:rFonts w:ascii="Arial" w:hAnsi="Arial" w:cs="Arial"/>
+                <w:b/>
+                <w:bCs/>
+              </w:rPr>
+              <w:t>sequência de experiência e processo</w:t>
             </w:r>
             <w:r>
               <w:rPr>

</xml_diff>